<commit_message>
Added Hospital Mapping and Modified Company Mapping.
</commit_message>
<xml_diff>
--- a/DataBase Tasks/Mapping/Company Mapping.docx
+++ b/DataBase Tasks/Mapping/Company Mapping.docx
@@ -296,21 +296,19 @@
     <w:tbl>
       <w:tblPr>
         <w:tblStyle w:val="TableGrid"/>
-        <w:tblW w:w="9388" w:type="dxa"/>
+        <w:tblW w:w="0" w:type="auto"/>
         <w:tblLook w:val="04A0" w:firstRow="1" w:lastRow="0" w:firstColumn="1" w:lastColumn="0" w:noHBand="0" w:noVBand="1"/>
       </w:tblPr>
       <w:tblGrid>
-        <w:gridCol w:w="3129"/>
-        <w:gridCol w:w="3129"/>
-        <w:gridCol w:w="3130"/>
+        <w:gridCol w:w="2337"/>
+        <w:gridCol w:w="2337"/>
+        <w:gridCol w:w="2338"/>
+        <w:gridCol w:w="2338"/>
       </w:tblGrid>
       <w:tr>
-        <w:trPr>
-          <w:trHeight w:val="287"/>
-        </w:trPr>
-        <w:tc>
-          <w:tcPr>
-            <w:tcW w:w="3129" w:type="dxa"/>
+        <w:tc>
+          <w:tcPr>
+            <w:tcW w:w="2337" w:type="dxa"/>
           </w:tcPr>
           <w:p>
             <w:proofErr w:type="spellStart"/>
@@ -322,7 +320,7 @@
         </w:tc>
         <w:tc>
           <w:tcPr>
-            <w:tcW w:w="3129" w:type="dxa"/>
+            <w:tcW w:w="2337" w:type="dxa"/>
           </w:tcPr>
           <w:p>
             <w:proofErr w:type="spellStart"/>
@@ -334,12 +332,24 @@
         </w:tc>
         <w:tc>
           <w:tcPr>
-            <w:tcW w:w="3130" w:type="dxa"/>
+            <w:tcW w:w="2338" w:type="dxa"/>
           </w:tcPr>
           <w:p>
             <w:r>
               <w:t>Location</w:t>
             </w:r>
+          </w:p>
+        </w:tc>
+        <w:tc>
+          <w:tcPr>
+            <w:tcW w:w="2338" w:type="dxa"/>
+          </w:tcPr>
+          <w:p>
+            <w:proofErr w:type="spellStart"/>
+            <w:r>
+              <w:t>DNum</w:t>
+            </w:r>
+            <w:proofErr w:type="spellEnd"/>
           </w:p>
         </w:tc>
       </w:tr>
@@ -358,7 +368,6 @@
       </w:tblPr>
       <w:tblGrid>
         <w:gridCol w:w="2402"/>
-        <w:gridCol w:w="2411"/>
         <w:gridCol w:w="2337"/>
         <w:gridCol w:w="2200"/>
       </w:tblGrid>
@@ -371,18 +380,6 @@
             <w:proofErr w:type="spellStart"/>
             <w:r>
               <w:t>PNum</w:t>
-            </w:r>
-            <w:proofErr w:type="spellEnd"/>
-          </w:p>
-        </w:tc>
-        <w:tc>
-          <w:tcPr>
-            <w:tcW w:w="2411" w:type="dxa"/>
-          </w:tcPr>
-          <w:p>
-            <w:proofErr w:type="spellStart"/>
-            <w:r>
-              <w:t>DNum</w:t>
             </w:r>
             <w:proofErr w:type="spellEnd"/>
           </w:p>

</xml_diff>